<commit_message>
Deploying to gh-pages from @ Morrison-Lab/sds@02f9200db80e47b8e01100c23eb31dacf9043df7 🚀
</commit_message>
<xml_diff>
--- a/nonparametric-models-handout.docx
+++ b/nonparametric-models-handout.docx
@@ -15,19 +15,19 @@
         <w:pStyle w:val="Date"/>
       </w:pPr>
       <w:r>
-        <w:t xml:space="preserve">Last modified: 2026-10-14 19:34:19 (PDT)</w:t>
+        <w:t xml:space="preserve">Last modified: 2026-10-14 22:39:48 (PDT)</w:t>
       </w:r>
     </w:p>
-    <w:bookmarkStart w:id="11" w:name="empirical-cdf"/>
+    <w:bookmarkStart w:id="14" w:name="empirical-distribution"/>
     <w:p>
       <w:pPr>
         <w:pStyle w:val="Heading2"/>
       </w:pPr>
       <w:r>
-        <w:t xml:space="preserve">1 Empirical CDF</w:t>
+        <w:t xml:space="preserve">1 Empirical distribution</w:t>
       </w:r>
     </w:p>
-    <w:bookmarkStart w:id="9" w:name="def-empirical-cdf"/>
+    <w:bookmarkStart w:id="10" w:name="def-empirical-distribution"/>
     <w:p>
       <w:pPr>
         <w:pStyle w:val="FirstParagraph"/>
@@ -37,7 +37,7 @@
           <w:b/>
           <w:bCs/>
         </w:rPr>
-        <w:t xml:space="preserve">Definition 1 (Empirical CDF)</w:t>
+        <w:t xml:space="preserve">Definition 1 (Empirical distribution)</w:t>
       </w:r>
       <w:r>
         <w:t xml:space="preserve"> </w:t>
@@ -109,29 +109,70 @@
           <w:b/>
           <w:bCs/>
         </w:rPr>
-        <w:t xml:space="preserve">empirical cumulative distribution function</w:t>
-      </w:r>
-      <w:r>
-        <w:t xml:space="preserve"> </w:t>
-      </w:r>
-      <w:r>
-        <w:t xml:space="preserve">(</w:t>
-      </w:r>
-      <w:r>
-        <w:rPr>
-          <w:b/>
-          <w:bCs/>
-        </w:rPr>
-        <w:t xml:space="preserve">empirical CDF</w:t>
-      </w:r>
-      <w:r>
-        <w:t xml:space="preserve">)</w:t>
-      </w:r>
-      <w:r>
-        <w:t xml:space="preserve"> </w:t>
-      </w:r>
-      <w:r>
-        <w:t xml:space="preserve">is the function</w:t>
+        <w:t xml:space="preserve">empirical distribution</w:t>
+      </w:r>
+      <w:r>
+        <w:t xml:space="preserve"> </w:t>
+      </w:r>
+      <w:r>
+        <w:t xml:space="preserve">is the distribution of a value</w:t>
+      </w:r>
+      <w:r>
+        <w:t xml:space="preserve"> </w:t>
+      </w:r>
+      <w:hyperlink r:id="rId9">
+        <w:r>
+          <w:rPr>
+            <w:rStyle w:val="Hyperlink"/>
+          </w:rPr>
+          <w:t xml:space="preserve">chosen at random</w:t>
+        </w:r>
+      </w:hyperlink>
+      <w:r>
+        <w:t xml:space="preserve"> </w:t>
+      </w:r>
+      <w:r>
+        <w:t xml:space="preserve">from the sample,</w:t>
+      </w:r>
+      <w:r>
+        <w:t xml:space="preserve"> </w:t>
+      </w:r>
+      <w:r>
+        <w:t xml:space="preserve">each of the</w:t>
+      </w:r>
+      <w:r>
+        <w:t xml:space="preserve"> </w:t>
+      </w:r>
+      <m:oMath>
+        <m:r>
+          <m:t>n</m:t>
+        </m:r>
+      </m:oMath>
+      <w:r>
+        <w:t xml:space="preserve"> </w:t>
+      </w:r>
+      <w:r>
+        <w:t xml:space="preserve">observations being equally likely:</w:t>
+      </w:r>
+      <w:r>
+        <w:t xml:space="preserve"> </w:t>
+      </w:r>
+      <w:r>
+        <w:t xml:space="preserve">the probability that the value falls in a set</w:t>
+      </w:r>
+      <w:r>
+        <w:t xml:space="preserve"> </w:t>
+      </w:r>
+      <m:oMath>
+        <m:r>
+          <m:t>A</m:t>
+        </m:r>
+      </m:oMath>
+      <w:r>
+        <w:t xml:space="preserve"> </w:t>
+      </w:r>
+      <w:r>
+        <w:t xml:space="preserve">is</w:t>
       </w:r>
     </w:p>
     <w:p>
@@ -143,30 +184,714 @@
           <m:jc m:val="center"/>
         </m:oMathParaPr>
         <m:oMath>
-          <m:acc>
-            <m:accPr>
-              <m:chr m:val="̂"/>
-            </m:accPr>
+          <m:f>
+            <m:fPr>
+              <m:type m:val="bar"/>
+            </m:fPr>
+            <m:num>
+              <m:r>
+                <m:t>1</m:t>
+              </m:r>
+            </m:num>
+            <m:den>
+              <m:r>
+                <m:t>n</m:t>
+              </m:r>
+            </m:den>
+          </m:f>
+          <m:nary>
+            <m:naryPr>
+              <m:chr m:val="∑"/>
+              <m:limLoc m:val="undOvr"/>
+              <m:subHide m:val="off"/>
+              <m:supHide m:val="off"/>
+            </m:naryPr>
+            <m:sub>
+              <m:r>
+                <m:t>j</m:t>
+              </m:r>
+              <m:r>
+                <m:rPr>
+                  <m:sty m:val="p"/>
+                </m:rPr>
+                <m:t>=</m:t>
+              </m:r>
+              <m:r>
+                <m:t>1</m:t>
+              </m:r>
+            </m:sub>
+            <m:sup>
+              <m:r>
+                <m:t>n</m:t>
+              </m:r>
+            </m:sup>
             <m:e>
               <m:r>
-                <m:t>F</m:t>
+                <m:rPr>
+                  <m:scr m:val="double-struck"/>
+                  <m:sty m:val="p"/>
+                </m:rPr>
+                <m:t>1</m:t>
               </m:r>
             </m:e>
-          </m:acc>
+          </m:nary>
           <m:r>
-            <m:rPr>
-              <m:sty m:val="p"/>
-            </m:rPr>
-            <m:t>(</m:t>
+            <m:t>​</m:t>
           </m:r>
+          <m:d>
+            <m:dPr>
+              <m:begChr m:val="("/>
+              <m:sepChr m:val=""/>
+              <m:endChr m:val=")"/>
+              <m:grow/>
+            </m:dPr>
+            <m:e>
+              <m:sSub>
+                <m:e>
+                  <m:r>
+                    <m:t>x</m:t>
+                  </m:r>
+                </m:e>
+                <m:sub>
+                  <m:r>
+                    <m:t>j</m:t>
+                  </m:r>
+                </m:sub>
+              </m:sSub>
+              <m:r>
+                <m:rPr>
+                  <m:sty m:val="p"/>
+                </m:rPr>
+                <m:t>∈</m:t>
+              </m:r>
+              <m:r>
+                <m:t>A</m:t>
+              </m:r>
+            </m:e>
+          </m:d>
           <m:r>
-            <m:t>t</m:t>
+            <m:t>​</m:t>
           </m:r>
           <m:r>
             <m:rPr>
               <m:sty m:val="p"/>
             </m:rPr>
-            <m:t>)</m:t>
+            <m:t>.</m:t>
+          </m:r>
+        </m:oMath>
+      </m:oMathPara>
+    </w:p>
+    <w:bookmarkEnd w:id="10"/>
+    <w:bookmarkStart w:id="11" w:name="exm-empirical-distribution"/>
+    <w:p>
+      <w:pPr>
+        <w:pStyle w:val="FirstParagraph"/>
+      </w:pPr>
+      <w:r>
+        <w:rPr>
+          <w:b/>
+          <w:bCs/>
+        </w:rPr>
+        <w:t xml:space="preserve">Example 1 (Numerical example: empirical distribution)</w:t>
+      </w:r>
+      <w:r>
+        <w:t xml:space="preserve"> </w:t>
+      </w:r>
+      <w:r>
+        <w:t xml:space="preserve">Suppose the observed values are</w:t>
+      </w:r>
+      <w:r>
+        <w:t xml:space="preserve"> </w:t>
+      </w:r>
+      <m:oMath>
+        <m:r>
+          <m:t>4</m:t>
+        </m:r>
+        <m:r>
+          <m:rPr>
+            <m:sty m:val="p"/>
+          </m:rPr>
+          <m:t>,</m:t>
+        </m:r>
+        <m:r>
+          <m:t>1</m:t>
+        </m:r>
+        <m:r>
+          <m:rPr>
+            <m:sty m:val="p"/>
+          </m:rPr>
+          <m:t>,</m:t>
+        </m:r>
+        <m:r>
+          <m:t>7</m:t>
+        </m:r>
+        <m:r>
+          <m:rPr>
+            <m:sty m:val="p"/>
+          </m:rPr>
+          <m:t>,</m:t>
+        </m:r>
+        <m:r>
+          <m:t>3</m:t>
+        </m:r>
+      </m:oMath>
+      <w:r>
+        <w:t xml:space="preserve">, so</w:t>
+      </w:r>
+      <w:r>
+        <w:t xml:space="preserve"> </w:t>
+      </w:r>
+      <m:oMath>
+        <m:r>
+          <m:t>n</m:t>
+        </m:r>
+        <m:r>
+          <m:rPr>
+            <m:sty m:val="p"/>
+          </m:rPr>
+          <m:t>=</m:t>
+        </m:r>
+        <m:r>
+          <m:t>4</m:t>
+        </m:r>
+      </m:oMath>
+      <w:r>
+        <w:t xml:space="preserve">,</w:t>
+      </w:r>
+      <w:r>
+        <w:t xml:space="preserve"> </w:t>
+      </w:r>
+      <w:r>
+        <w:t xml:space="preserve">and let</w:t>
+      </w:r>
+      <w:r>
+        <w:t xml:space="preserve"> </w:t>
+      </w:r>
+      <m:oMath>
+        <m:r>
+          <m:t>A</m:t>
+        </m:r>
+        <m:r>
+          <m:rPr>
+            <m:sty m:val="p"/>
+          </m:rPr>
+          <m:t>=</m:t>
+        </m:r>
+        <m:r>
+          <m:rPr>
+            <m:sty m:val="p"/>
+          </m:rPr>
+          <m:t>[</m:t>
+        </m:r>
+        <m:r>
+          <m:t>2</m:t>
+        </m:r>
+        <m:r>
+          <m:rPr>
+            <m:sty m:val="p"/>
+          </m:rPr>
+          <m:t>,</m:t>
+        </m:r>
+        <m:r>
+          <m:t>5</m:t>
+        </m:r>
+        <m:r>
+          <m:rPr>
+            <m:sty m:val="p"/>
+          </m:rPr>
+          <m:t>)</m:t>
+        </m:r>
+      </m:oMath>
+      <w:r>
+        <w:t xml:space="preserve">.</w:t>
+      </w:r>
+      <w:r>
+        <w:t xml:space="preserve"> </w:t>
+      </w:r>
+      <w:r>
+        <w:t xml:space="preserve">Two of the four values (4 and 3) lie in</w:t>
+      </w:r>
+      <w:r>
+        <w:t xml:space="preserve"> </w:t>
+      </w:r>
+      <m:oMath>
+        <m:r>
+          <m:t>A</m:t>
+        </m:r>
+      </m:oMath>
+      <w:r>
+        <w:t xml:space="preserve">,</w:t>
+      </w:r>
+      <w:r>
+        <w:t xml:space="preserve"> </w:t>
+      </w:r>
+      <w:r>
+        <w:t xml:space="preserve">so the empirical distribution gives</w:t>
+      </w:r>
+      <w:r>
+        <w:t xml:space="preserve"> </w:t>
+      </w:r>
+      <m:oMath>
+        <m:r>
+          <m:t>A</m:t>
+        </m:r>
+      </m:oMath>
+      <w:r>
+        <w:t xml:space="preserve"> </w:t>
+      </w:r>
+      <w:r>
+        <w:t xml:space="preserve">probability</w:t>
+      </w:r>
+      <w:r>
+        <w:t xml:space="preserve"> </w:t>
+      </w:r>
+      <m:oMath>
+        <m:r>
+          <m:t>2</m:t>
+        </m:r>
+        <m:r>
+          <m:rPr>
+            <m:sty m:val="p"/>
+          </m:rPr>
+          <m:t>/</m:t>
+        </m:r>
+        <m:r>
+          <m:t>4</m:t>
+        </m:r>
+        <m:r>
+          <m:rPr>
+            <m:sty m:val="p"/>
+          </m:rPr>
+          <m:t>=</m:t>
+        </m:r>
+        <m:r>
+          <m:t>0.5</m:t>
+        </m:r>
+      </m:oMath>
+      <w:r>
+        <w:t xml:space="preserve">.</w:t>
+      </w:r>
+      <w:r>
+        <w:t xml:space="preserve"> </w:t>
+      </w:r>
+      <w:r>
+        <w:t xml:space="preserve">Each observed value has probability</w:t>
+      </w:r>
+      <w:r>
+        <w:t xml:space="preserve"> </w:t>
+      </w:r>
+      <m:oMath>
+        <m:r>
+          <m:t>1</m:t>
+        </m:r>
+        <m:r>
+          <m:rPr>
+            <m:sty m:val="p"/>
+          </m:rPr>
+          <m:t>/</m:t>
+        </m:r>
+        <m:r>
+          <m:t>4</m:t>
+        </m:r>
+      </m:oMath>
+      <w:r>
+        <w:t xml:space="preserve">,</w:t>
+      </w:r>
+      <w:r>
+        <w:t xml:space="preserve"> </w:t>
+      </w:r>
+      <w:r>
+        <w:t xml:space="preserve">and any set containing none of them has probability</w:t>
+      </w:r>
+      <w:r>
+        <w:t xml:space="preserve"> </w:t>
+      </w:r>
+      <m:oMath>
+        <m:r>
+          <m:t>0</m:t>
+        </m:r>
+      </m:oMath>
+      <w:r>
+        <w:t xml:space="preserve">.</w:t>
+      </w:r>
+    </w:p>
+    <w:bookmarkEnd w:id="11"/>
+    <w:p>
+      <w:pPr>
+        <w:pStyle w:val="BodyText"/>
+      </w:pPr>
+      <w:r>
+        <w:rPr>
+          <w:i/>
+          <w:iCs/>
+        </w:rPr>
+        <w:t xml:space="preserve">Remark</w:t>
+      </w:r>
+      <w:r>
+        <w:t xml:space="preserve"> (What</w:t>
+      </w:r>
+      <w:r>
+        <w:t xml:space="preserve"> </w:t>
+      </w:r>
+      <w:r>
+        <w:t xml:space="preserve">“empirical”</w:t>
+      </w:r>
+      <w:r>
+        <w:t xml:space="preserve"> </w:t>
+      </w:r>
+      <w:r>
+        <w:t xml:space="preserve">means). </w:t>
+      </w:r>
+      <w:r>
+        <w:t xml:space="preserve">“Empirical”</w:t>
+      </w:r>
+      <w:r>
+        <w:t xml:space="preserve"> </w:t>
+      </w:r>
+      <w:r>
+        <w:t xml:space="preserve">means computed from the observed data,</w:t>
+      </w:r>
+      <w:r>
+        <w:t xml:space="preserve"> </w:t>
+      </w:r>
+      <w:r>
+        <w:t xml:space="preserve">not from a model or a population.</w:t>
+      </w:r>
+      <w:r>
+        <w:t xml:space="preserve"> </w:t>
+      </w:r>
+      <w:r>
+        <w:t xml:space="preserve">An empirical quantity is the matching population quantity</w:t>
+      </w:r>
+      <w:r>
+        <w:t xml:space="preserve"> </w:t>
+      </w:r>
+      <w:r>
+        <w:t xml:space="preserve">with the</w:t>
+      </w:r>
+      <w:r>
+        <w:t xml:space="preserve"> </w:t>
+      </w:r>
+      <w:hyperlink r:id="rId12">
+        <w:r>
+          <w:rPr>
+            <w:rStyle w:val="Hyperlink"/>
+          </w:rPr>
+          <w:t xml:space="preserve">population distribution</w:t>
+        </w:r>
+      </w:hyperlink>
+      <w:r>
+        <w:t xml:space="preserve"> </w:t>
+      </w:r>
+      <w:r>
+        <w:t xml:space="preserve">replaced by the empirical distribution.</w:t>
+      </w:r>
+      <w:r>
+        <w:t xml:space="preserve"> </w:t>
+      </w:r>
+      <w:r>
+        <w:t xml:space="preserve">For example,</w:t>
+      </w:r>
+      <w:r>
+        <w:t xml:space="preserve"> </w:t>
+      </w:r>
+      <w:r>
+        <w:t xml:space="preserve">the mean of the empirical distribution is the</w:t>
+      </w:r>
+      <w:r>
+        <w:t xml:space="preserve"> </w:t>
+      </w:r>
+      <w:hyperlink r:id="rId13">
+        <w:r>
+          <w:rPr>
+            <w:rStyle w:val="Hyperlink"/>
+          </w:rPr>
+          <w:t xml:space="preserve">sample mean</w:t>
+        </w:r>
+      </w:hyperlink>
+      <w:r>
+        <w:t xml:space="preserve">,</w:t>
+      </w:r>
+      <w:r>
+        <w:t xml:space="preserve"> </w:t>
+      </w:r>
+      <w:r>
+        <w:t xml:space="preserve">and its CDF is the</w:t>
+      </w:r>
+      <w:r>
+        <w:t xml:space="preserve"> </w:t>
+      </w:r>
+      <w:hyperlink w:anchor="def-empirical-cdf">
+        <w:r>
+          <w:rPr>
+            <w:rStyle w:val="Hyperlink"/>
+          </w:rPr>
+          <w:t xml:space="preserve">empirical CDF</w:t>
+        </w:r>
+      </w:hyperlink>
+      <w:r>
+        <w:t xml:space="preserve">.</w:t>
+      </w:r>
+      <w:r>
+        <w:t xml:space="preserve"> </w:t>
+      </w:r>
+      <w:r>
+        <w:t xml:space="preserve">Machine learning uses the same replacement</w:t>
+      </w:r>
+      <w:r>
+        <w:t xml:space="preserve"> </w:t>
+      </w:r>
+      <w:r>
+        <w:t xml:space="preserve">to turn the risk of a prediction model into its</w:t>
+      </w:r>
+      <w:r>
+        <w:t xml:space="preserve"> </w:t>
+      </w:r>
+      <w:r>
+        <w:rPr>
+          <w:i/>
+          <w:iCs/>
+        </w:rPr>
+        <w:t xml:space="preserve">empirical risk</w:t>
+      </w:r>
+      <w:r>
+        <w:t xml:space="preserve">.</w:t>
+      </w:r>
+    </w:p>
+    <w:p>
+      <w:pPr>
+        <w:pStyle w:val="BodyText"/>
+      </w:pPr>
+      <w:r>
+        <w:t xml:space="preserve">Because it needs only the data in hand,</w:t>
+      </w:r>
+      <w:r>
+        <w:t xml:space="preserve"> </w:t>
+      </w:r>
+      <w:r>
+        <w:t xml:space="preserve">an empirical quantity can always be computed,</w:t>
+      </w:r>
+      <w:r>
+        <w:t xml:space="preserve"> </w:t>
+      </w:r>
+      <w:r>
+        <w:t xml:space="preserve">and it serves as an estimate of the population quantity it mimics.</w:t>
+      </w:r>
+      <w:r>
+        <w:t xml:space="preserve"> </w:t>
+      </w:r>
+      <w:r>
+        <w:t xml:space="preserve">The bootstrap rests on this replacement:</w:t>
+      </w:r>
+      <w:r>
+        <w:t xml:space="preserve"> </w:t>
+      </w:r>
+      <w:r>
+        <w:t xml:space="preserve">it estimates the variability of a statistic</w:t>
+      </w:r>
+      <w:r>
+        <w:t xml:space="preserve"> </w:t>
+      </w:r>
+      <w:r>
+        <w:t xml:space="preserve">by sampling from the empirical distribution</w:t>
+      </w:r>
+      <w:r>
+        <w:t xml:space="preserve"> </w:t>
+      </w:r>
+      <w:r>
+        <w:t xml:space="preserve">(Hastie et al. 2009, sec. 7.11, p. 250; Efron and Tibshirani 1993)</w:t>
+      </w:r>
+      <w:r>
+        <w:t xml:space="preserve">.</w:t>
+      </w:r>
+    </w:p>
+    <w:bookmarkEnd w:id="14"/>
+    <w:bookmarkStart w:id="18" w:name="empirical-cdf"/>
+    <w:p>
+      <w:pPr>
+        <w:pStyle w:val="Heading2"/>
+      </w:pPr>
+      <w:r>
+        <w:t xml:space="preserve">2 Empirical CDF</w:t>
+      </w:r>
+    </w:p>
+    <w:bookmarkStart w:id="16" w:name="def-empirical-cdf"/>
+    <w:p>
+      <w:pPr>
+        <w:pStyle w:val="FirstParagraph"/>
+      </w:pPr>
+      <w:r>
+        <w:rPr>
+          <w:b/>
+          <w:bCs/>
+        </w:rPr>
+        <w:t xml:space="preserve">Definition 2 (Empirical CDF)</w:t>
+      </w:r>
+      <w:r>
+        <w:t xml:space="preserve"> </w:t>
+      </w:r>
+      <w:r>
+        <w:t xml:space="preserve">For observed values</w:t>
+      </w:r>
+      <w:r>
+        <w:t xml:space="preserve"> </w:t>
+      </w:r>
+      <m:oMath>
+        <m:sSub>
+          <m:e>
+            <m:r>
+              <m:t>x</m:t>
+            </m:r>
+          </m:e>
+          <m:sub>
+            <m:r>
+              <m:t>1</m:t>
+            </m:r>
+          </m:sub>
+        </m:sSub>
+        <m:r>
+          <m:rPr>
+            <m:sty m:val="p"/>
+          </m:rPr>
+          <m:t>,</m:t>
+        </m:r>
+        <m:r>
+          <m:rPr>
+            <m:sty m:val="p"/>
+          </m:rPr>
+          <m:t>…</m:t>
+        </m:r>
+        <m:r>
+          <m:rPr>
+            <m:sty m:val="p"/>
+          </m:rPr>
+          <m:t>,</m:t>
+        </m:r>
+        <m:sSub>
+          <m:e>
+            <m:r>
+              <m:t>x</m:t>
+            </m:r>
+          </m:e>
+          <m:sub>
+            <m:r>
+              <m:t>n</m:t>
+            </m:r>
+          </m:sub>
+        </m:sSub>
+      </m:oMath>
+      <w:r>
+        <w:t xml:space="preserve">,</w:t>
+      </w:r>
+      <w:r>
+        <w:t xml:space="preserve"> </w:t>
+      </w:r>
+      <w:r>
+        <w:t xml:space="preserve">the</w:t>
+      </w:r>
+      <w:r>
+        <w:t xml:space="preserve"> </w:t>
+      </w:r>
+      <w:r>
+        <w:rPr>
+          <w:b/>
+          <w:bCs/>
+        </w:rPr>
+        <w:t xml:space="preserve">empirical cumulative distribution function</w:t>
+      </w:r>
+      <w:r>
+        <w:t xml:space="preserve"> </w:t>
+      </w:r>
+      <w:r>
+        <w:t xml:space="preserve">(</w:t>
+      </w:r>
+      <w:r>
+        <w:rPr>
+          <w:b/>
+          <w:bCs/>
+        </w:rPr>
+        <w:t xml:space="preserve">empirical CDF</w:t>
+      </w:r>
+      <w:r>
+        <w:t xml:space="preserve">)</w:t>
+      </w:r>
+      <w:r>
+        <w:t xml:space="preserve"> </w:t>
+      </w:r>
+      <w:r>
+        <w:t xml:space="preserve">is the</w:t>
+      </w:r>
+      <w:r>
+        <w:t xml:space="preserve"> </w:t>
+      </w:r>
+      <w:hyperlink r:id="rId15">
+        <w:r>
+          <w:rPr>
+            <w:rStyle w:val="Hyperlink"/>
+          </w:rPr>
+          <w:t xml:space="preserve">CDF</w:t>
+        </w:r>
+      </w:hyperlink>
+      <w:r>
+        <w:t xml:space="preserve"> </w:t>
+      </w:r>
+      <w:r>
+        <w:t xml:space="preserve">of the</w:t>
+      </w:r>
+      <w:r>
+        <w:t xml:space="preserve"> </w:t>
+      </w:r>
+      <w:hyperlink w:anchor="def-empirical-distribution">
+        <w:r>
+          <w:rPr>
+            <w:rStyle w:val="Hyperlink"/>
+          </w:rPr>
+          <w:t xml:space="preserve">empirical distribution</w:t>
+        </w:r>
+      </w:hyperlink>
+      <w:r>
+        <w:t xml:space="preserve">,</w:t>
+      </w:r>
+      <w:r>
+        <w:t xml:space="preserve"> </w:t>
+      </w:r>
+      <w:r>
+        <w:t xml:space="preserve">the function</w:t>
+      </w:r>
+    </w:p>
+    <w:p>
+      <w:pPr>
+        <w:pStyle w:val="BodyText"/>
+      </w:pPr>
+      <m:oMathPara>
+        <m:oMathParaPr>
+          <m:jc m:val="center"/>
+        </m:oMathParaPr>
+        <m:oMath>
+          <m:r>
+            <m:rPr>
+              <m:sty m:val="p"/>
+            </m:rPr>
+            <m:t/>
+          </m:r>
+          <m:r>
+            <m:t>​</m:t>
+          </m:r>
+          <m:d>
+            <m:dPr>
+              <m:begChr m:val="("/>
+              <m:sepChr m:val=""/>
+              <m:endChr m:val=")"/>
+              <m:grow/>
+            </m:dPr>
+            <m:e>
+              <m:r>
+                <m:t>t</m:t>
+              </m:r>
+            </m:e>
+          </m:d>
+          <m:r>
+            <m:t>​</m:t>
           </m:r>
           <m:limUpp>
             <m:e>
@@ -434,8 +1159,8 @@
         <w:t xml:space="preserve">otherwise.</w:t>
       </w:r>
     </w:p>
-    <w:bookmarkEnd w:id="9"/>
-    <w:bookmarkStart w:id="10" w:name="exm-empirical-cdf"/>
+    <w:bookmarkEnd w:id="16"/>
+    <w:bookmarkStart w:id="17" w:name="exm-empirical-cdf"/>
     <w:p>
       <w:pPr>
         <w:pStyle w:val="BodyText"/>
@@ -445,7 +1170,7 @@
           <w:b/>
           <w:bCs/>
         </w:rPr>
-        <w:t xml:space="preserve">Example 1 (Numerical example: empirical CDF)</w:t>
+        <w:t xml:space="preserve">Example 2 (Numerical example: empirical CDF)</w:t>
       </w:r>
       <w:r>
         <w:t xml:space="preserve"> </w:t>
@@ -961,18 +1686,18 @@
         <w:t xml:space="preserve">, because every value is at most 7.</w:t>
       </w:r>
     </w:p>
-    <w:bookmarkEnd w:id="10"/>
-    <w:bookmarkEnd w:id="11"/>
-    <w:bookmarkStart w:id="14" w:name="order-statistics"/>
+    <w:bookmarkEnd w:id="17"/>
+    <w:bookmarkEnd w:id="18"/>
+    <w:bookmarkStart w:id="21" w:name="order-statistics"/>
     <w:p>
       <w:pPr>
         <w:pStyle w:val="Heading2"/>
       </w:pPr>
       <w:r>
-        <w:t xml:space="preserve">2 Order statistics</w:t>
+        <w:t xml:space="preserve">3 Order statistics</w:t>
       </w:r>
     </w:p>
-    <w:bookmarkStart w:id="12" w:name="def-order-statistics"/>
+    <w:bookmarkStart w:id="19" w:name="def-order-statistics"/>
     <w:p>
       <w:pPr>
         <w:pStyle w:val="FirstParagraph"/>
@@ -982,7 +1707,7 @@
           <w:b/>
           <w:bCs/>
         </w:rPr>
-        <w:t xml:space="preserve">Definition 2 (Order statistics)</w:t>
+        <w:t xml:space="preserve">Definition 3 (Order statistics)</w:t>
       </w:r>
       <w:r>
         <w:t xml:space="preserve"> </w:t>
@@ -1261,8 +1986,8 @@
         <w:t xml:space="preserve">is the largest.</w:t>
       </w:r>
     </w:p>
-    <w:bookmarkEnd w:id="12"/>
-    <w:bookmarkStart w:id="13" w:name="exm-order-statistics"/>
+    <w:bookmarkEnd w:id="19"/>
+    <w:bookmarkStart w:id="20" w:name="exm-order-statistics"/>
     <w:p>
       <w:pPr>
         <w:pStyle w:val="BodyText"/>
@@ -1272,7 +1997,7 @@
           <w:b/>
           <w:bCs/>
         </w:rPr>
-        <w:t xml:space="preserve">Example 2 (Numerical example: order statistics)</w:t>
+        <w:t xml:space="preserve">Example 3 (Numerical example: order statistics)</w:t>
       </w:r>
       <w:r>
         <w:t xml:space="preserve"> </w:t>
@@ -1489,18 +2214,18 @@
         <w:t xml:space="preserve">.</w:t>
       </w:r>
     </w:p>
-    <w:bookmarkEnd w:id="13"/>
-    <w:bookmarkEnd w:id="14"/>
-    <w:bookmarkStart w:id="22" w:name="sample-quantiles"/>
+    <w:bookmarkEnd w:id="20"/>
+    <w:bookmarkEnd w:id="21"/>
+    <w:bookmarkStart w:id="28" w:name="sample-quantiles"/>
     <w:p>
       <w:pPr>
         <w:pStyle w:val="Heading2"/>
       </w:pPr>
       <w:r>
-        <w:t xml:space="preserve">3 Sample quantiles</w:t>
+        <w:t xml:space="preserve">4 Sample quantiles</w:t>
       </w:r>
     </w:p>
-    <w:bookmarkStart w:id="15" w:name="def-sample-quantile"/>
+    <w:bookmarkStart w:id="22" w:name="def-sample-quantile"/>
     <w:p>
       <w:pPr>
         <w:pStyle w:val="FirstParagraph"/>
@@ -1510,7 +2235,7 @@
           <w:b/>
           <w:bCs/>
         </w:rPr>
-        <w:t xml:space="preserve">Definition 3 (Sample quantile function)</w:t>
+        <w:t xml:space="preserve">Definition 4 (Sample quantile function)</w:t>
       </w:r>
       <w:r>
         <w:t xml:space="preserve"> </w:t>
@@ -1746,8 +2471,8 @@
         </m:oMath>
       </m:oMathPara>
     </w:p>
-    <w:bookmarkEnd w:id="15"/>
-    <w:bookmarkStart w:id="16" w:name="def-sample-p-quantile"/>
+    <w:bookmarkEnd w:id="22"/>
+    <w:bookmarkStart w:id="23" w:name="def-sample-p-quantile"/>
     <w:p>
       <w:pPr>
         <w:pStyle w:val="FirstParagraph"/>
@@ -1757,7 +2482,7 @@
           <w:b/>
           <w:bCs/>
         </w:rPr>
-        <w:t xml:space="preserve">Definition 4 (Sample quantile)</w:t>
+        <w:t xml:space="preserve">Definition 5 (Sample quantile)</w:t>
       </w:r>
       <w:r>
         <w:t xml:space="preserve"> </w:t>
@@ -1910,7 +2635,7 @@
         <w:t xml:space="preserve">.</w:t>
       </w:r>
     </w:p>
-    <w:bookmarkEnd w:id="16"/>
+    <w:bookmarkEnd w:id="23"/>
     <w:p>
       <w:pPr>
         <w:pStyle w:val="BodyText"/>
@@ -1921,7 +2646,7 @@
       <w:r>
         <w:t xml:space="preserve"> </w:t>
       </w:r>
-      <w:hyperlink r:id="rId17">
+      <w:hyperlink r:id="rId15">
         <w:r>
           <w:rPr>
             <w:rStyle w:val="Hyperlink"/>
@@ -1946,7 +2671,7 @@
       <w:r>
         <w:t xml:space="preserve"> </w:t>
       </w:r>
-      <w:hyperlink r:id="rId18">
+      <w:hyperlink r:id="rId24">
         <w:r>
           <w:rPr>
             <w:rStyle w:val="Hyperlink"/>
@@ -2048,7 +2773,7 @@
         <w:t xml:space="preserve">.</w:t>
       </w:r>
     </w:p>
-    <w:bookmarkStart w:id="19" w:name="thm-sample-quantile-order-statistics"/>
+    <w:bookmarkStart w:id="25" w:name="thm-sample-quantile-order-statistics"/>
     <w:p>
       <w:pPr>
         <w:pStyle w:val="BodyText"/>
@@ -2450,7 +3175,7 @@
         <w:t xml:space="preserve">.</w:t>
       </w:r>
     </w:p>
-    <w:bookmarkEnd w:id="19"/>
+    <w:bookmarkEnd w:id="25"/>
     <w:p>
       <w:pPr>
         <w:pStyle w:val="BodyText"/>
@@ -3494,7 +4219,7 @@
         <w:t xml:space="preserve">.</w:t>
       </w:r>
     </w:p>
-    <w:bookmarkStart w:id="20" w:name="exm-sample-quantile"/>
+    <w:bookmarkStart w:id="26" w:name="exm-sample-quantile"/>
     <w:p>
       <w:pPr>
         <w:pStyle w:val="BodyText"/>
@@ -3504,7 +4229,7 @@
           <w:b/>
           <w:bCs/>
         </w:rPr>
-        <w:t xml:space="preserve">Example 3 (Numerical example: sample quantiles)</w:t>
+        <w:t xml:space="preserve">Example 4 (Numerical example: sample quantiles)</w:t>
       </w:r>
       <w:r>
         <w:t xml:space="preserve"> </w:t>
@@ -4281,8 +5006,8 @@
         <w:t xml:space="preserve">#&gt;   3   7</w:t>
       </w:r>
     </w:p>
-    <w:bookmarkEnd w:id="20"/>
-    <w:bookmarkStart w:id="21" w:name="rem-quantile-conventions"/>
+    <w:bookmarkEnd w:id="26"/>
+    <w:bookmarkStart w:id="27" w:name="rem-quantile-conventions"/>
     <w:p>
       <w:pPr>
         <w:pStyle w:val="FirstParagraph"/>
@@ -4410,7 +5135,7 @@
           <w:rPr>
             <w:rStyle w:val="Hyperlink"/>
           </w:rPr>
-          <w:t xml:space="preserve">Definition 3</w:t>
+          <w:t xml:space="preserve">Definition 4</w:t>
         </w:r>
       </w:hyperlink>
       <w:r>
@@ -4423,18 +5148,18 @@
         <w:t xml:space="preserve">which always returns one of the observed values.</w:t>
       </w:r>
     </w:p>
-    <w:bookmarkEnd w:id="21"/>
-    <w:bookmarkEnd w:id="22"/>
-    <w:bookmarkStart w:id="32" w:name="X098afd29d2cc0af81e1daaf31ade1d91d7df2a7"/>
+    <w:bookmarkEnd w:id="27"/>
+    <w:bookmarkEnd w:id="28"/>
+    <w:bookmarkStart w:id="43" w:name="X098afd29d2cc0af81e1daaf31ade1d91d7df2a7"/>
     <w:p>
       <w:pPr>
         <w:pStyle w:val="Heading2"/>
       </w:pPr>
       <w:r>
-        <w:t xml:space="preserve">4 The empirical CDF and quantile function as generalized inverses</w:t>
+        <w:t xml:space="preserve">5 The empirical CDF and quantile function as generalized inverses</w:t>
       </w:r>
     </w:p>
-    <w:bookmarkStart w:id="31" w:name="fig-ecdf-sample-quantile-example"/>
+    <w:bookmarkStart w:id="37" w:name="fig-ecdf-sample-quantile-example"/>
     <w:tbl>
       <w:tblPr>
         <w:tblStyle w:val="Table"/>
@@ -4462,7 +5187,7 @@
             <w:tr>
               <w:tc>
                 <w:tcPr/>
-                <w:bookmarkStart w:id="26" w:name="fig-ecdf-example"/>
+                <w:bookmarkStart w:id="32" w:name="fig-ecdf-example"/>
                 <w:p>
                   <w:pPr>
                     <w:pStyle w:val="SourceCode"/>
@@ -5911,18 +6636,18 @@
                       <wp:inline>
                         <wp:extent cx="2971800" cy="2377440"/>
                         <wp:effectExtent b="0" l="0" r="0" t="0"/>
-                        <wp:docPr descr="" title="" id="24" name="Picture"/>
+                        <wp:docPr descr="" title="" id="30" name="Picture"/>
                         <a:graphic>
                           <a:graphicData uri="http://schemas.openxmlformats.org/drawingml/2006/picture">
                             <pic:pic>
                               <pic:nvPicPr>
-                                <pic:cNvPr descr="nonparametric-models_files/figure-docx/unnamed-chunk-2-1.png" id="25" name="Picture"/>
+                                <pic:cNvPr descr="nonparametric-models_files/figure-docx/unnamed-chunk-2-1.png" id="31" name="Picture"/>
                                 <pic:cNvPicPr>
                                   <a:picLocks noChangeArrowheads="1" noChangeAspect="1"/>
                                 </pic:cNvPicPr>
                               </pic:nvPicPr>
                               <pic:blipFill>
-                                <a:blip r:embed="rId23"/>
+                                <a:blip r:embed="rId29"/>
                                 <a:stretch>
                                   <a:fillRect/>
                                 </a:stretch>
@@ -5975,7 +6700,7 @@
                     <w:t xml:space="preserve">open circles mark excluded endpoints.</w:t>
                   </w:r>
                 </w:p>
-                <w:bookmarkEnd w:id="26"/>
+                <w:bookmarkEnd w:id="32"/>
               </w:tc>
             </w:tr>
           </w:tbl>
@@ -6025,7 +6750,7 @@
             <w:tr>
               <w:tc>
                 <w:tcPr/>
-                <w:bookmarkStart w:id="30" w:name="fig-eqf-example"/>
+                <w:bookmarkStart w:id="36" w:name="fig-eqf-example"/>
                 <w:p>
                   <w:pPr>
                     <w:pStyle w:val="SourceCode"/>
@@ -6982,18 +7707,18 @@
                       <wp:inline>
                         <wp:extent cx="2971800" cy="2377440"/>
                         <wp:effectExtent b="0" l="0" r="0" t="0"/>
-                        <wp:docPr descr="" title="" id="28" name="Picture"/>
+                        <wp:docPr descr="" title="" id="34" name="Picture"/>
                         <a:graphic>
                           <a:graphicData uri="http://schemas.openxmlformats.org/drawingml/2006/picture">
                             <pic:pic>
                               <pic:nvPicPr>
-                                <pic:cNvPr descr="nonparametric-models_files/figure-docx/unnamed-chunk-3-1.png" id="29" name="Picture"/>
+                                <pic:cNvPr descr="nonparametric-models_files/figure-docx/unnamed-chunk-3-1.png" id="35" name="Picture"/>
                                 <pic:cNvPicPr>
                                   <a:picLocks noChangeArrowheads="1" noChangeAspect="1"/>
                                 </pic:cNvPicPr>
                               </pic:nvPicPr>
                               <pic:blipFill>
-                                <a:blip r:embed="rId27"/>
+                                <a:blip r:embed="rId33"/>
                                 <a:stretch>
                                   <a:fillRect/>
                                 </a:stretch>
@@ -7046,7 +7771,7 @@
                     <w:t xml:space="preserve">closed circles mark included right endpoints.</w:t>
                   </w:r>
                 </w:p>
-                <w:bookmarkEnd w:id="30"/>
+                <w:bookmarkEnd w:id="36"/>
               </w:tc>
             </w:tr>
           </w:tbl>
@@ -7078,7 +7803,7 @@
         <w:t xml:space="preserve">(order statistics 1, 3, 4, 7).</w:t>
       </w:r>
     </w:p>
-    <w:bookmarkEnd w:id="31"/>
+    <w:bookmarkEnd w:id="37"/>
     <w:p>
       <w:pPr>
         <w:pStyle w:val="BodyText"/>
@@ -7442,7 +8167,83 @@
         <w:t xml:space="preserve">with equality only at the observed values.</w:t>
       </w:r>
     </w:p>
-    <w:bookmarkEnd w:id="32"/>
+    <w:bookmarkStart w:id="42" w:name="refs"/>
+    <w:bookmarkStart w:id="39" w:name="ref-efron1993introduction"/>
+    <w:p>
+      <w:pPr>
+        <w:pStyle w:val="Bibliography"/>
+      </w:pPr>
+      <w:r>
+        <w:t xml:space="preserve">Efron, Bradley, and Robert J. Tibshirani. 1993.</w:t>
+      </w:r>
+      <w:r>
+        <w:t xml:space="preserve"> </w:t>
+      </w:r>
+      <w:r>
+        <w:rPr>
+          <w:i/>
+          <w:iCs/>
+        </w:rPr>
+        <w:t xml:space="preserve">An Introduction to the Bootstrap</w:t>
+      </w:r>
+      <w:r>
+        <w:t xml:space="preserve">. Monographs on Statistics and Applied Probability 57. Chapman &amp; Hall/CRC.</w:t>
+      </w:r>
+      <w:r>
+        <w:t xml:space="preserve"> </w:t>
+      </w:r>
+      <w:hyperlink r:id="rId38">
+        <w:r>
+          <w:rPr>
+            <w:rStyle w:val="Hyperlink"/>
+          </w:rPr>
+          <w:t xml:space="preserve">https://doi.org/10.1201/9780429246593</w:t>
+        </w:r>
+      </w:hyperlink>
+      <w:r>
+        <w:t xml:space="preserve">.</w:t>
+      </w:r>
+    </w:p>
+    <w:bookmarkEnd w:id="39"/>
+    <w:bookmarkStart w:id="41" w:name="ref-hastie2009elements"/>
+    <w:p>
+      <w:pPr>
+        <w:pStyle w:val="Bibliography"/>
+      </w:pPr>
+      <w:r>
+        <w:t xml:space="preserve">Hastie, Trevor, Robert Tibshirani, and Jerome Friedman. 2009.</w:t>
+      </w:r>
+      <w:r>
+        <w:t xml:space="preserve"> </w:t>
+      </w:r>
+      <w:r>
+        <w:rPr>
+          <w:i/>
+          <w:iCs/>
+        </w:rPr>
+        <w:t xml:space="preserve">The Elements of Statistical Learning: Data Mining, Inference, and Prediction</w:t>
+      </w:r>
+      <w:r>
+        <w:t xml:space="preserve">. 2nd ed. Springer.</w:t>
+      </w:r>
+      <w:r>
+        <w:t xml:space="preserve"> </w:t>
+      </w:r>
+      <w:hyperlink r:id="rId40">
+        <w:r>
+          <w:rPr>
+            <w:rStyle w:val="Hyperlink"/>
+          </w:rPr>
+          <w:t xml:space="preserve">https://doi.org/10.1007/978-0-387-84858-7</w:t>
+        </w:r>
+      </w:hyperlink>
+      <w:r>
+        <w:t xml:space="preserve">.</w:t>
+      </w:r>
+    </w:p>
+    <w:bookmarkEnd w:id="41"/>
+    <w:bookmarkEnd w:id="42"/>
+    <w:bookmarkEnd w:id="43"/>
     <w:sectPr>
       <w:footnotePr>
         <w:numRestart w:val="eachSect"/>

</xml_diff>